<commit_message>
docs(bd): health map - Port Hardy reclassified (construction-imminent = designed)
Ian''s catch: a hospital starting construction summer 2026 was structurally
designed long ago - "no design team publicly named" is not an open seat. Port
Hardy moved from the decidable-now target list to incumbent-intel background;
EKRH sharpened to time-critical (DB award ~mid-2026 = being decided now -
verify first). Seat stamps ingested accordingly: Port Hardy + UHNBC + Richmond
= unknown (not open); Kamloops Cancer + BCCH-CHC = filled with verified
incumbents; 6 genuine gates stamped likely-open; BCCH concept-dup MPI 7574
retired.

Co-Authored-By: Claude Fable 5 <noreply@anthropic.com>
</commit_message>
<xml_diff>
--- a/docs/KOR-BC-Health-Capital-Map-2026-07-01.docx
+++ b/docs/KOR-BC-Health-Capital-Map-2026-07-01.docx
@@ -82,7 +82,7 @@
     </w:p>
     <w:p>
       <w:r>
-        <w:pict w14:anchorId="6A33BDC5">
+        <w:pict w14:anchorId="290880CC">
           <v:rect id="_x0000_i1025" style="width:0;height:1.5pt" o:hralign="center" o:hrstd="t" o:hr="t"/>
         </w:pict>
       </w:r>
@@ -1108,6 +1108,7 @@
     </w:p>
     <w:p>
       <w:pPr>
+        <w:pStyle w:val="Compact"/>
         <w:numPr>
           <w:ilvl w:val="0"/>
           <w:numId w:val="3"/>
@@ -1131,14 +1132,25 @@
           <w:b/>
           <w:bCs/>
         </w:rPr>
-        <w:t>Design-Build procurement in flight; DB team award ~mid-2026; architect and SE not yet public.</w:t>
-      </w:r>
-      <w:r>
-        <w:t xml:space="preserve"> Route: the shortlisted DB contractors. [V 0.75]</w:t>
-      </w:r>
-    </w:p>
-    <w:p>
-      <w:pPr>
+        <w:t>DB team award “~mid-2026” — i.e., being decided right now or just decided.</w:t>
+      </w:r>
+      <w:r>
+        <w:t xml:space="preserve"> Time-critical: verify the award status </w:t>
+      </w:r>
+      <w:r>
+        <w:rPr>
+          <w:i/>
+          <w:iCs/>
+        </w:rPr>
+        <w:t>this week</w:t>
+      </w:r>
+      <w:r>
+        <w:t xml:space="preserve"> (MERX/IH); if unawarded, the seat is inside the competing DB teams; if awarded, capture the winner as incumbent intel. [V 0.75]</w:t>
+      </w:r>
+    </w:p>
+    <w:p>
+      <w:pPr>
+        <w:pStyle w:val="Compact"/>
         <w:numPr>
           <w:ilvl w:val="0"/>
           <w:numId w:val="3"/>
@@ -1162,7 +1174,10 @@
         <w:t>re-paced</w:t>
       </w:r>
       <w:r>
-        <w:t xml:space="preserve"> by Budget 2026. The SE seats live </w:t>
+        <w:t xml:space="preserve"> </w:t>
+      </w:r>
+      <w:r>
+        <w:t xml:space="preserve">by Budget 2026 and not yet issued — the one genuinely pre-decision competitive gate in this window. The SE seats live </w:t>
       </w:r>
       <w:r>
         <w:rPr>
@@ -1172,20 +1187,24 @@
         <w:t>inside the shortlisted proponent teams</w:t>
       </w:r>
       <w:r>
+        <w:t>; if any team’s SE slot is uncommitted, this is the most imminent seat. Watch IBC for the RFP release. [V 0.8]</w:t>
+      </w:r>
+    </w:p>
+    <w:p>
+      <w:pPr>
+        <w:pStyle w:val="FirstParagraph"/>
+      </w:pPr>
+      <w:r>
+        <w:rPr>
+          <w:i/>
+          <w:iCs/>
+        </w:rPr>
+        <w:t>Reclassified out of this list — the “construction imminent = already designed” rule:</w:t>
+      </w:r>
+      <w:r>
         <w:t xml:space="preserve"> </w:t>
       </w:r>
       <w:r>
-        <w:t>— if any team’s SE slot is uncommitted, this is the most imminent competitive seat. Watch IBC for the RFP release. [V 0.8]</w:t>
-      </w:r>
-    </w:p>
-    <w:p>
-      <w:pPr>
-        <w:numPr>
-          <w:ilvl w:val="0"/>
-          <w:numId w:val="3"/>
-        </w:numPr>
-      </w:pPr>
-      <w:r>
         <w:rPr>
           <w:b/>
           <w:bCs/>
@@ -1193,275 +1212,34 @@
         <w:t>Port Hardy Hospital</w:t>
       </w:r>
       <w:r>
-        <w:t xml:space="preserve"> ($45M, Island Health; construction summer 2026, </w:t>
-      </w:r>
-      <w:r>
-        <w:rPr>
-          <w:b/>
-          <w:bCs/>
-        </w:rPr>
-        <w:t>no design team publicly named</w:t>
-      </w:r>
-      <w:r>
-        <w:t xml:space="preserve"> — either imminent or quietly engaged; needs one manual BC Bid check to resolve). Island geography = KOR edge. [V 0.7] ### Near-term (6–18 months)</w:t>
-      </w:r>
-    </w:p>
-    <w:p>
-      <w:pPr>
-        <w:numPr>
-          <w:ilvl w:val="0"/>
-          <w:numId w:val="3"/>
-        </w:numPr>
-      </w:pPr>
-      <w:r>
-        <w:rPr>
-          <w:b/>
-          <w:bCs/>
-        </w:rPr>
-        <w:t>VGH+ — 900/990 W 12th</w:t>
-      </w:r>
-      <w:r>
-        <w:t xml:space="preserve"> (~$400M Ph1; Foundation-led; </w:t>
-      </w:r>
-      <w:r>
-        <w:rPr>
-          <w:b/>
-          <w:bCs/>
-        </w:rPr>
-        <w:t>MCM architect named, SE open</w:t>
-      </w:r>
-      <w:r>
-        <w:t xml:space="preserve">; demolition ~mid-2027 ⇒ consultant build-out inside 6–18 months, </w:t>
-      </w:r>
-      <w:r>
-        <w:rPr>
-          <w:b/>
-          <w:bCs/>
-        </w:rPr>
-        <w:t>picked by MCM/Foundation directly</w:t>
-      </w:r>
-      <w:r>
-        <w:t xml:space="preserve"> — no IBC gate). High-seismic site. The single cleanest direct-relationship target on the list. [V/I 0.6]</w:t>
-      </w:r>
-    </w:p>
-    <w:p>
-      <w:pPr>
-        <w:numPr>
-          <w:ilvl w:val="0"/>
-          <w:numId w:val="3"/>
-        </w:numPr>
-      </w:pPr>
-      <w:r>
-        <w:rPr>
-          <w:b/>
-          <w:bCs/>
-        </w:rPr>
-        <w:lastRenderedPageBreak/>
-        <w:t>Vernon Jubilee — psychiatric inpatient unit</w:t>
-      </w:r>
-      <w:r>
-        <w:t xml:space="preserve"> ($110–140M, Interior Health; concept-plan stage, original 2026 construction has slipped; architect and SE both open; business-plan → RFQ is the gate). [V 0.6]</w:t>
-      </w:r>
-    </w:p>
-    <w:p>
-      <w:pPr>
-        <w:numPr>
-          <w:ilvl w:val="0"/>
-          <w:numId w:val="3"/>
-        </w:numPr>
-      </w:pPr>
-      <w:r>
-        <w:rPr>
-          <w:b/>
-          <w:bCs/>
-        </w:rPr>
-        <w:t>VGH Campus Ph1–2 acute building</w:t>
-      </w:r>
-      <w:r>
-        <w:t xml:space="preserve"> (VCH; interim rezoning before Council </w:t>
-      </w:r>
-      <w:r>
-        <w:rPr>
-          <w:b/>
-          <w:bCs/>
-        </w:rPr>
-        <w:t>Summer 2026</w:t>
-      </w:r>
-      <w:r>
-        <w:t>; Kasian holds the master plan only — the Ph1–2 building design team is unprocured, likely an IBC team-RFQ within 12–24 months). [I 0.6]</w:t>
-      </w:r>
-    </w:p>
-    <w:p>
-      <w:pPr>
-        <w:numPr>
-          <w:ilvl w:val="0"/>
-          <w:numId w:val="3"/>
-        </w:numPr>
-      </w:pPr>
-      <w:r>
-        <w:rPr>
-          <w:b/>
-          <w:bCs/>
-        </w:rPr>
-        <w:t>UHNBC Acute Care Tower</w:t>
-      </w:r>
-      <w:r>
-        <w:t xml:space="preserve"> ($1.579B→$1.68B, Northern Health; alliance signed, design through late 2026; </w:t>
-      </w:r>
-      <w:r>
-        <w:rPr>
-          <w:b/>
-          <w:bCs/>
-        </w:rPr>
-        <w:t>the structural seat is still publicly unnamed</w:t>
-      </w:r>
-      <w:r>
-        <w:t xml:space="preserve"> — most likely inside DIALOG BC’s own scope, but genuinely unannounced [V 0.9]. The July-10 DIALOG meeting carries the capacity-support probe; monitor DIALOG/IBC/JOC through late 2026.) ### Mid-term (18–36 months)</w:t>
-      </w:r>
-    </w:p>
-    <w:p>
-      <w:pPr>
-        <w:numPr>
-          <w:ilvl w:val="0"/>
-          <w:numId w:val="3"/>
-        </w:numPr>
-      </w:pPr>
-      <w:r>
-        <w:rPr>
-          <w:b/>
-          <w:bCs/>
-        </w:rPr>
-        <w:t>Surrey Memorial — new acute tower</w:t>
-      </w:r>
-      <w:r>
-        <w:t xml:space="preserve"> (Fraser Health; business-planning; recent FH pattern says Alliance or DB ⇒ </w:t>
-      </w:r>
-      <w:r>
-        <w:rPr>
-          <w:b/>
-          <w:bCs/>
-        </w:rPr>
-        <w:t>position with GCs now</w:t>
-      </w:r>
-      <w:r>
-        <w:t xml:space="preserve"> — Graham, PCL, EllisDon, Bird). [I 0.5]</w:t>
-      </w:r>
-    </w:p>
-    <w:p>
-      <w:pPr>
-        <w:numPr>
-          <w:ilvl w:val="0"/>
-          <w:numId w:val="3"/>
-        </w:numPr>
-      </w:pPr>
-      <w:r>
-        <w:rPr>
-          <w:b/>
-          <w:bCs/>
-        </w:rPr>
-        <w:t>NRGH Nanaimo — patient tower</w:t>
-      </w:r>
-      <w:r>
-        <w:t xml:space="preserve"> (Island Health; concept plan ~summer 2027, design-team RFP likely 2027–28; alliance-likely). </w:t>
-      </w:r>
-      <w:r>
-        <w:rPr>
-          <w:b/>
-          <w:bCs/>
-        </w:rPr>
-        <w:t>The premier future gate on Island geography.</w:t>
-      </w:r>
-      <w:r>
-        <w:t xml:space="preserve"> [V/I 0.6]</w:t>
-      </w:r>
-    </w:p>
-    <w:p>
-      <w:pPr>
-        <w:numPr>
-          <w:ilvl w:val="0"/>
-          <w:numId w:val="3"/>
-        </w:numPr>
-      </w:pPr>
-      <w:r>
-        <w:rPr>
-          <w:b/>
-          <w:bCs/>
-        </w:rPr>
-        <w:t>Burnaby Ph2 + BC Cancer “refresh”</w:t>
-      </w:r>
-      <w:r>
         <w:t xml:space="preserve"> </w:t>
       </w:r>
       <w:r>
-        <w:t>(wildcard: PCL+Parkin hold the ADA; the Budget-2026 refresh could rescope or reopen the team — if it proceeds, any unfilled SE sub-seat is PCL/Parkin’s to give). [V 0.7 on status]</w:t>
-      </w:r>
-    </w:p>
-    <w:p>
-      <w:pPr>
-        <w:numPr>
-          <w:ilvl w:val="0"/>
-          <w:numId w:val="3"/>
-        </w:numPr>
-      </w:pPr>
-      <w:r>
-        <w:rPr>
-          <w:b/>
-          <w:bCs/>
-        </w:rPr>
-        <w:t>The frozen Fraser Valley LTC class</w:t>
-      </w:r>
-      <w:r>
-        <w:t xml:space="preserve"> (Abbotsford $211M, Chilliwack $274M, Delta ~$198M — design contracts cancelled/paused Apr 2026 pending a provincial standard-design/modular review; Langley LTC + Langley Memorial behind them). Cheap to monitor; potentially fast re-tenders when unfrozen. [V 0.85]</w:t>
-      </w:r>
-    </w:p>
-    <w:p>
-      <w:pPr>
-        <w:numPr>
-          <w:ilvl w:val="0"/>
-          <w:numId w:val="3"/>
-        </w:numPr>
-      </w:pPr>
-      <w:r>
-        <w:rPr>
-          <w:b/>
-          <w:bCs/>
-        </w:rPr>
-        <w:t>Kitimat Hospital</w:t>
-      </w:r>
-      <w:r>
-        <w:t xml:space="preserve"> </w:t>
-      </w:r>
-      <w:r>
-        <w:t xml:space="preserve">(master-plan stage; multi-year Northern lead). [V 0.6] ### Locked / context (do not pursue the seat) Kamloops Cancer Centre (EllisDon PDB — </w:t>
-      </w:r>
-      <w:r>
-        <w:rPr>
-          <w:b/>
-          <w:bCs/>
-        </w:rPr>
-        <w:t>Glotman Simpson</w:t>
-      </w:r>
-      <w:r>
-        <w:t xml:space="preserve">, u/c to 2028) · Cowichan/Quw’utsun (~90% complete — Bush Bohlman) · New Surrey &amp; BC Cancer (EllisDon DB, SE undisclosed, u/c) · New St. Paul’s (RJC+MKA, patients Spring 2027) · BCCH-CHC (Ledcor DB, Fast+Epp, complete Dec 2027) · RCH Ph2 opened May 2026 (Bush Bohlman; Ph3 renos = FH CM through ~2029, carryover likely) · Cariboo Memorial (Graham+Stantec PDB — Stantec in-house) · RIH Kamloops tower (complete/Ph2 closing) · Richmond Ph2–3 (Graham+HDR alliance — seat embedded at RFQ [I 0.8]; schedule itself in </w:t>
-      </w:r>
-      <w:r>
-        <w:t>flux post-Budget-2026).</w:t>
-      </w:r>
-    </w:p>
-    <w:p>
-      <w:pPr>
-        <w:pStyle w:val="Heading2"/>
-      </w:pPr>
-      <w:bookmarkStart w:id="6" w:name="the-se-incumbent-map-who-kor-displaces-v"/>
-      <w:bookmarkEnd w:id="4"/>
-      <w:bookmarkEnd w:id="5"/>
-      <w:r>
-        <w:t>4. The SE incumbent map (who KOR displaces) [V]</w:t>
-      </w:r>
-    </w:p>
-    <w:p>
-      <w:pPr>
-        <w:pStyle w:val="Compact"/>
+        <w:t xml:space="preserve">($45M, construction summer 2026). A building starting construction now was structurally designed long ago — the design team certainly exists; it just isn’t publicly named. This is </w:t>
+      </w:r>
+      <w:r>
+        <w:rPr>
+          <w:b/>
+          <w:bCs/>
+        </w:rPr>
+        <w:t>incumbent-intel only</w:t>
+      </w:r>
+      <w:r>
+        <w:t xml:space="preserve"> (one manual BC Bid check identifies who holds it), </w:t>
+      </w:r>
+      <w:r>
+        <w:rPr>
+          <w:b/>
+          <w:bCs/>
+        </w:rPr>
+        <w:t>not a pursuit</w:t>
+      </w:r>
+      <w:r>
+        <w:t>. It stays on the map as background and as a data point for the Island SE landscape. ### Near-term (6–18 months)</w:t>
+      </w:r>
+    </w:p>
+    <w:p>
+      <w:pPr>
         <w:numPr>
           <w:ilvl w:val="0"/>
           <w:numId w:val="4"/>
@@ -1472,19 +1250,35 @@
           <w:b/>
           <w:bCs/>
         </w:rPr>
-        <w:t>Glotman Simpson — the volume leader</w:t>
-      </w:r>
-      <w:r>
-        <w:t xml:space="preserve"> (~10 documented BC health structural seats: RIH Ph1+2, Burnaby Ph1, Penticton/Kampe, VGH Diamond HCC, Lions Gate </w:t>
-      </w:r>
-      <w:r>
         <w:lastRenderedPageBreak/>
-        <w:t>HOpe, BC Cancer Research, Haida Gwaii, JPOCSC Surrey, + Kamloops Cancer Centre new-build).</w:t>
-      </w:r>
-    </w:p>
-    <w:p>
-      <w:pPr>
-        <w:pStyle w:val="Compact"/>
+        <w:t>VGH+ — 900/990 W 12th</w:t>
+      </w:r>
+      <w:r>
+        <w:t xml:space="preserve"> (~$400M Ph1; Foundation-led; </w:t>
+      </w:r>
+      <w:r>
+        <w:rPr>
+          <w:b/>
+          <w:bCs/>
+        </w:rPr>
+        <w:t>MCM architect named, SE open</w:t>
+      </w:r>
+      <w:r>
+        <w:t xml:space="preserve">; demolition ~mid-2027 ⇒ consultant build-out inside 6–18 months, </w:t>
+      </w:r>
+      <w:r>
+        <w:rPr>
+          <w:b/>
+          <w:bCs/>
+        </w:rPr>
+        <w:t>picked by MCM/Foundation directly</w:t>
+      </w:r>
+      <w:r>
+        <w:t xml:space="preserve"> — no IBC gate). High-seismic site. The single cleanest direct-relationship target on the list. [V/I 0.6]</w:t>
+      </w:r>
+    </w:p>
+    <w:p>
+      <w:pPr>
         <w:numPr>
           <w:ilvl w:val="0"/>
           <w:numId w:val="4"/>
@@ -1495,15 +1289,14 @@
           <w:b/>
           <w:bCs/>
         </w:rPr>
-        <w:t>Bush Bohlman — the mega-project specialist</w:t>
-      </w:r>
-      <w:r>
-        <w:t xml:space="preserve"> (Cowichan ~$1.5B; Surrey Memorial CCT; RCH Ph2; Langley Memorial; UBCO Health Sciences; structural-only firm, so every credit is a seat).</w:t>
-      </w:r>
-    </w:p>
-    <w:p>
-      <w:pPr>
-        <w:pStyle w:val="Compact"/>
+        <w:t>Vernon Jubilee — psychiatric inpatient unit</w:t>
+      </w:r>
+      <w:r>
+        <w:t xml:space="preserve"> ($110–140M, Interior Health; concept-plan stage, original 2026 construction has slipped; architect and SE both open; business-plan → RFQ is the gate). [V 0.6]</w:t>
+      </w:r>
+    </w:p>
+    <w:p>
+      <w:pPr>
         <w:numPr>
           <w:ilvl w:val="0"/>
           <w:numId w:val="4"/>
@@ -1514,58 +1307,24 @@
           <w:b/>
           <w:bCs/>
         </w:rPr>
-        <w:t>RJC</w:t>
-      </w:r>
-      <w:r>
-        <w:t xml:space="preserve"> </w:t>
-      </w:r>
-      <w:r>
-        <w:t xml:space="preserve">(Abbotsford Regional P3, Interior Heart &amp; Surgical, </w:t>
-      </w:r>
-      <w:r>
-        <w:rPr>
-          <w:b/>
-          <w:bCs/>
-        </w:rPr>
-        <w:t>BC Cancer North — commonly misattributed to Fast+Epp</w:t>
-      </w:r>
-      <w:r>
-        <w:t xml:space="preserve">, New St. Paul’s shared) · </w:t>
-      </w:r>
-      <w:r>
-        <w:rPr>
-          <w:b/>
-          <w:bCs/>
-        </w:rPr>
-        <w:t>MKA</w:t>
-      </w:r>
-      <w:r>
-        <w:t xml:space="preserve"> (Teck ACC, New St. Paul’s — the US import on marquee jobs) · </w:t>
-      </w:r>
-      <w:r>
-        <w:rPr>
-          <w:b/>
-          <w:bCs/>
-        </w:rPr>
-        <w:t>Fast+Epp</w:t>
-      </w:r>
-      <w:r>
-        <w:t xml:space="preserve"> (BCCH-CHC; New St. Paul’s was indicative-design only) · </w:t>
-      </w:r>
-      <w:r>
-        <w:rPr>
-          <w:b/>
-          <w:bCs/>
-        </w:rPr>
-        <w:t>CWMM</w:t>
-      </w:r>
-      <w:r>
-        <w:t xml:space="preserve"> (interior-BC niche).</w:t>
-      </w:r>
-    </w:p>
-    <w:p>
-      <w:pPr>
-        <w:pStyle w:val="Compact"/>
+        <w:t>VGH Campus Ph1–2 acute building</w:t>
+      </w:r>
+      <w:r>
+        <w:t xml:space="preserve"> (VCH; interim rezoning before Council </w:t>
+      </w:r>
+      <w:r>
+        <w:rPr>
+          <w:b/>
+          <w:bCs/>
+        </w:rPr>
+        <w:t>Summer 2026</w:t>
+      </w:r>
+      <w:r>
+        <w:t>; Kasian holds the master plan only — the Ph1–2 building design team is unprocured, likely an IBC team-RFQ within 12–24 months). [I 0.6]</w:t>
+      </w:r>
+    </w:p>
+    <w:p>
+      <w:pPr>
         <w:numPr>
           <w:ilvl w:val="0"/>
           <w:numId w:val="4"/>
@@ -1576,15 +1335,24 @@
           <w:b/>
           <w:bCs/>
         </w:rPr>
-        <w:t>Verified negatives:</w:t>
-      </w:r>
-      <w:r>
-        <w:t xml:space="preserve"> Entuitive = building-envelope roles only in BC health (the “Entuitive on Richmond” claim is unsubstantiated); WSP = no BC health structural-EOR found; Krahn/Associated = absent from the niche.</w:t>
-      </w:r>
-    </w:p>
-    <w:p>
-      <w:pPr>
-        <w:pStyle w:val="Compact"/>
+        <w:t>UHNBC Acute Care Tower</w:t>
+      </w:r>
+      <w:r>
+        <w:t xml:space="preserve"> ($1.579B→$1.68B, Northern Health; alliance signed, design through late 2026; </w:t>
+      </w:r>
+      <w:r>
+        <w:rPr>
+          <w:b/>
+          <w:bCs/>
+        </w:rPr>
+        <w:t>the structural seat is still publicly unnamed</w:t>
+      </w:r>
+      <w:r>
+        <w:t xml:space="preserve"> — most likely inside DIALOG BC’s own scope, but genuinely unannounced [V 0.9]. The July-10 DIALOG meeting carries the capacity-support probe; monitor DIALOG/IBC/JOC through late 2026.) ### Mid-term (18–36 months)</w:t>
+      </w:r>
+    </w:p>
+    <w:p>
+      <w:pPr>
         <w:numPr>
           <w:ilvl w:val="0"/>
           <w:numId w:val="4"/>
@@ -1595,30 +1363,133 @@
           <w:b/>
           <w:bCs/>
         </w:rPr>
-        <w:t>Structure of the market:</w:t>
-      </w:r>
-      <w:r>
-        <w:t xml:space="preserve"> no single firm owns the alliance/DB channel — the seat follows the </w:t>
-      </w:r>
-      <w:r>
-        <w:rPr>
-          <w:i/>
-          <w:iCs/>
-        </w:rPr>
-        <w:t>team</w:t>
-      </w:r>
-      <w:r>
-        <w:t>, which is why pre-RFQ teaming (not brand) decides winners.</w:t>
+        <w:t>Surrey Memorial — new acute tower</w:t>
+      </w:r>
+      <w:r>
+        <w:t xml:space="preserve"> (Fraser Health; business-planning; recent FH pattern says Alliance or DB ⇒ </w:t>
+      </w:r>
+      <w:r>
+        <w:rPr>
+          <w:b/>
+          <w:bCs/>
+        </w:rPr>
+        <w:t>position with GCs now</w:t>
+      </w:r>
+      <w:r>
+        <w:t xml:space="preserve"> — Graham, PCL, EllisDon, Bird). [I 0.5]</w:t>
+      </w:r>
+    </w:p>
+    <w:p>
+      <w:pPr>
+        <w:numPr>
+          <w:ilvl w:val="0"/>
+          <w:numId w:val="4"/>
+        </w:numPr>
+      </w:pPr>
+      <w:r>
+        <w:rPr>
+          <w:b/>
+          <w:bCs/>
+        </w:rPr>
+        <w:t>NRGH Nanaimo — patient tower</w:t>
+      </w:r>
+      <w:r>
+        <w:t xml:space="preserve"> (Island Health; concept plan ~summer 2027, design-team RFP likely 2027–28; alliance-likely). </w:t>
+      </w:r>
+      <w:r>
+        <w:rPr>
+          <w:b/>
+          <w:bCs/>
+        </w:rPr>
+        <w:t>The premier future gate on Island geography.</w:t>
+      </w:r>
+      <w:r>
+        <w:t xml:space="preserve"> [V/I 0.6]</w:t>
+      </w:r>
+    </w:p>
+    <w:p>
+      <w:pPr>
+        <w:numPr>
+          <w:ilvl w:val="0"/>
+          <w:numId w:val="4"/>
+        </w:numPr>
+      </w:pPr>
+      <w:r>
+        <w:rPr>
+          <w:b/>
+          <w:bCs/>
+        </w:rPr>
+        <w:t>Burnaby Ph2 + BC Cancer “refresh”</w:t>
+      </w:r>
+      <w:r>
+        <w:t xml:space="preserve"> </w:t>
+      </w:r>
+      <w:r>
+        <w:t>(wildcard: PCL+Parkin hold the ADA; the Budget-2026 refresh could rescope or reopen the team — if it proceeds, any unfilled SE sub-seat is PCL/Parkin’s to give). [V 0.7 on status]</w:t>
+      </w:r>
+    </w:p>
+    <w:p>
+      <w:pPr>
+        <w:numPr>
+          <w:ilvl w:val="0"/>
+          <w:numId w:val="4"/>
+        </w:numPr>
+      </w:pPr>
+      <w:r>
+        <w:rPr>
+          <w:b/>
+          <w:bCs/>
+        </w:rPr>
+        <w:t>The frozen Fraser Valley LTC class</w:t>
+      </w:r>
+      <w:r>
+        <w:t xml:space="preserve"> (Abbotsford $211M, Chilliwack $274M, Delta ~$198M — design contracts cancelled/paused Apr 2026 pending a provincial standard-design/modular review; Langley LTC + Langley Memorial behind them). Cheap to monitor; potentially fast re-tenders when unfrozen. [V 0.85]</w:t>
+      </w:r>
+    </w:p>
+    <w:p>
+      <w:pPr>
+        <w:numPr>
+          <w:ilvl w:val="0"/>
+          <w:numId w:val="4"/>
+        </w:numPr>
+      </w:pPr>
+      <w:r>
+        <w:rPr>
+          <w:b/>
+          <w:bCs/>
+        </w:rPr>
+        <w:t>Kitimat Hospital</w:t>
+      </w:r>
+      <w:r>
+        <w:t xml:space="preserve"> </w:t>
+      </w:r>
+      <w:r>
+        <w:t xml:space="preserve">(master-plan stage; multi-year Northern lead). [V 0.6] ### Locked / context (do not pursue the seat) Kamloops Cancer Centre (EllisDon PDB — </w:t>
+      </w:r>
+      <w:r>
+        <w:rPr>
+          <w:b/>
+          <w:bCs/>
+        </w:rPr>
+        <w:t>Glotman Simpson</w:t>
+      </w:r>
+      <w:r>
+        <w:t xml:space="preserve">, u/c to 2028) · Cowichan/Quw’utsun (~90% complete — Bush Bohlman) · New Surrey &amp; BC Cancer (EllisDon DB, SE undisclosed, u/c) · New St. Paul’s (RJC+MKA, patients Spring 2027) · BCCH-CHC (Ledcor DB, Fast+Epp, complete Dec 2027) · RCH Ph2 opened May 2026 (Bush Bohlman; Ph3 renos = FH CM through ~2029, carryover likely) · Cariboo Memorial (Graham+Stantec PDB — Stantec in-house) · RIH Kamloops tower (complete/Ph2 closing) · Richmond Ph2–3 (Graham+HDR alliance — seat embedded at RFQ [I 0.8]; schedule itself in </w:t>
+      </w:r>
+      <w:r>
+        <w:t>flux post-Budget-2026).</w:t>
       </w:r>
     </w:p>
     <w:p>
       <w:pPr>
         <w:pStyle w:val="Heading2"/>
       </w:pPr>
-      <w:bookmarkStart w:id="7" w:name="kors-positioning-evidence-led"/>
-      <w:bookmarkEnd w:id="6"/>
-      <w:r>
-        <w:t>5. KOR’s positioning (evidence-led)</w:t>
+      <w:bookmarkStart w:id="6" w:name="the-se-incumbent-map-who-kor-displaces-v"/>
+      <w:bookmarkEnd w:id="4"/>
+      <w:bookmarkEnd w:id="5"/>
+      <w:r>
+        <w:lastRenderedPageBreak/>
+        <w:t>4. The SE incumbent map (who KOR displaces) [V]</w:t>
       </w:r>
     </w:p>
     <w:p>
@@ -1634,13 +1505,10 @@
           <w:b/>
           <w:bCs/>
         </w:rPr>
-        <w:t>The seismic claim lands on the right targets:</w:t>
-      </w:r>
-      <w:r>
-        <w:t xml:space="preserve"> VGH campus, VGH+, Burnaby Ph2, Richmond phases are all high-seismic (Richmond + liquefaction); Cowichan set the “post-disaster facility” </w:t>
-      </w:r>
-      <w:r>
-        <w:t>precedent standard. Interior/North targets (UHNBC, Cariboo, EKRH) are low-moderate hazard — lead with capacity and delivery there, not seismicity.</w:t>
+        <w:t>Glotman Simpson — the volume leader</w:t>
+      </w:r>
+      <w:r>
+        <w:t xml:space="preserve"> (~10 documented BC health structural seats: RIH Ph1+2, Burnaby Ph1, Penticton/Kampe, VGH Diamond HCC, Lions Gate HOpe, BC Cancer Research, Haida Gwaii, JPOCSC Surrey, + Kamloops Cancer Centre new-build).</w:t>
       </w:r>
     </w:p>
     <w:p>
@@ -1656,10 +1524,10 @@
           <w:b/>
           <w:bCs/>
         </w:rPr>
-        <w:t>Geography:</w:t>
-      </w:r>
-      <w:r>
-        <w:t xml:space="preserve"> NRGH, Port Hardy, and the Island pipeline sit where the Metro incumbents have no local presence — the same displacement logic KOR already runs against Glotman on Island/Interior private work.</w:t>
+        <w:t>Bush Bohlman — the mega-project specialist</w:t>
+      </w:r>
+      <w:r>
+        <w:t xml:space="preserve"> (Cowichan ~$1.5B; Surrey Memorial CCT; RCH Ph2; Langley Memorial; UBCO Health Sciences; structural-only firm, so every credit is a seat).</w:t>
       </w:r>
     </w:p>
     <w:p>
@@ -1675,23 +1543,111 @@
           <w:b/>
           <w:bCs/>
         </w:rPr>
-        <w:t>Channel actions this quarter:</w:t>
+        <w:t>RJC</w:t>
       </w:r>
       <w:r>
         <w:t xml:space="preserve"> </w:t>
       </w:r>
       <w:r>
-        <w:t>(a) resolve Port Hardy with one manual BC Bid check; (b) open the MCM/Foundation conversation on VGH+ (architect named, seat open, no IBC gate); (c) put KOR on one GC’s pursuit-team bench (Graham, Bird, or EllisDon) before the Squamish/West Van RFP and Surrey Memorial RFQ land; (d) run the UHNBC probe via the July-10 DIALOG meeting; (e) track EKRH’s DB award.</w:t>
+        <w:t xml:space="preserve">(Abbotsford Regional P3, Interior Heart &amp; Surgical, </w:t>
+      </w:r>
+      <w:r>
+        <w:rPr>
+          <w:b/>
+          <w:bCs/>
+        </w:rPr>
+        <w:t>BC Cancer North — commonly misattributed to Fast+Epp</w:t>
+      </w:r>
+      <w:r>
+        <w:t xml:space="preserve">, New St. Paul’s shared) · </w:t>
+      </w:r>
+      <w:r>
+        <w:rPr>
+          <w:b/>
+          <w:bCs/>
+        </w:rPr>
+        <w:t>MKA</w:t>
+      </w:r>
+      <w:r>
+        <w:t xml:space="preserve"> (Teck ACC, New St. Paul’s — the US import on marquee jobs) · </w:t>
+      </w:r>
+      <w:r>
+        <w:rPr>
+          <w:b/>
+          <w:bCs/>
+        </w:rPr>
+        <w:t>Fast+Epp</w:t>
+      </w:r>
+      <w:r>
+        <w:t xml:space="preserve"> (BCCH-CHC; New St. Paul’s was indicative-design only) · </w:t>
+      </w:r>
+      <w:r>
+        <w:rPr>
+          <w:b/>
+          <w:bCs/>
+        </w:rPr>
+        <w:t>CWMM</w:t>
+      </w:r>
+      <w:r>
+        <w:t xml:space="preserve"> (interior-BC niche).</w:t>
+      </w:r>
+    </w:p>
+    <w:p>
+      <w:pPr>
+        <w:pStyle w:val="Compact"/>
+        <w:numPr>
+          <w:ilvl w:val="0"/>
+          <w:numId w:val="5"/>
+        </w:numPr>
+      </w:pPr>
+      <w:r>
+        <w:rPr>
+          <w:b/>
+          <w:bCs/>
+        </w:rPr>
+        <w:t>Verified negatives:</w:t>
+      </w:r>
+      <w:r>
+        <w:t xml:space="preserve"> Entuitive = building-envelope roles only in BC health (the “Entuitive on Richmond” claim is unsubstantiated); WSP = no BC health structural-EOR found; Krahn/Associated = absent from the niche.</w:t>
+      </w:r>
+    </w:p>
+    <w:p>
+      <w:pPr>
+        <w:pStyle w:val="Compact"/>
+        <w:numPr>
+          <w:ilvl w:val="0"/>
+          <w:numId w:val="5"/>
+        </w:numPr>
+      </w:pPr>
+      <w:r>
+        <w:rPr>
+          <w:b/>
+          <w:bCs/>
+        </w:rPr>
+        <w:t>Structure of the market:</w:t>
+      </w:r>
+      <w:r>
+        <w:t xml:space="preserve"> no single firm owns the alliance/DB channel — the seat follows the </w:t>
+      </w:r>
+      <w:r>
+        <w:rPr>
+          <w:i/>
+          <w:iCs/>
+        </w:rPr>
+        <w:t>team</w:t>
+      </w:r>
+      <w:r>
+        <w:t>, which is why pre-RFQ teaming (not brand) decides winners.</w:t>
       </w:r>
     </w:p>
     <w:p>
       <w:pPr>
         <w:pStyle w:val="Heading2"/>
       </w:pPr>
-      <w:bookmarkStart w:id="8" w:name="X0813d5ff6208524b26176c85587700616a70e60"/>
-      <w:bookmarkEnd w:id="7"/>
-      <w:r>
-        <w:t>6. Honesty ledger (what a skeptic should know)</w:t>
+      <w:bookmarkStart w:id="7" w:name="kors-positioning-evidence-led"/>
+      <w:bookmarkEnd w:id="6"/>
+      <w:r>
+        <w:t>5. KOR’s positioning (evidence-led)</w:t>
       </w:r>
     </w:p>
     <w:p>
@@ -1707,13 +1663,13 @@
           <w:b/>
           <w:bCs/>
         </w:rPr>
-        <w:t>Value conflicts unresolved:</w:t>
-      </w:r>
-      <w:r>
-        <w:t xml:space="preserve"> </w:t>
-      </w:r>
-      <w:r>
-        <w:t>EKRH $58.9M vs $104.7M; Dr. F.W. Green $156.5M vs $232M; RIH $457M vs $490M — health-authority list pages contradict their own project releases; this map prefers dedicated project pages and says so per row in the source files.</w:t>
+        <w:t>The seismic claim lands on the right targets:</w:t>
+      </w:r>
+      <w:r>
+        <w:t xml:space="preserve"> VGH campus, VGH+, Burnaby Ph2, Richmond phases are all high-seismic (Richmond + liquefaction); Cowichan set the “post-disaster facility” </w:t>
+      </w:r>
+      <w:r>
+        <w:t>precedent standard. Interior/North targets (UHNBC, Cariboo, EKRH) are low-moderate hazard — lead with capacity and delivery there, not seismicity.</w:t>
       </w:r>
     </w:p>
     <w:p>
@@ -1729,10 +1685,10 @@
           <w:b/>
           <w:bCs/>
         </w:rPr>
-        <w:t>Schedule conflicts:</w:t>
-      </w:r>
-      <w:r>
-        <w:t xml:space="preserve"> Richmond construction “2026→2029” (Aug 2024 release) vs “2028→2033” (post-Budget-2026 reporting) — the later dates are treated as current.</w:t>
+        <w:t>Geography:</w:t>
+      </w:r>
+      <w:r>
+        <w:t xml:space="preserve"> NRGH, Port Hardy, and the Island pipeline sit where the Metro incumbents have no local presence — the same displacement logic KOR already runs against Glotman on Island/Interior private work.</w:t>
       </w:r>
     </w:p>
     <w:p>
@@ -1748,13 +1704,23 @@
           <w:b/>
           <w:bCs/>
         </w:rPr>
-        <w:t>Genuinely unknown:</w:t>
+        <w:t>Channel actions this quarter:</w:t>
       </w:r>
       <w:r>
         <w:t xml:space="preserve"> </w:t>
       </w:r>
       <w:r>
-        <w:t>New Surrey’s SE identity (undisclosed, u/c); UHNBC’s structural arrangement (unannounced); Port Hardy’s team; Burnaby Ph2’s post-refresh shape; BC Bid contents (not machine-readable).</w:t>
+        <w:t>(a) resolve Port Hardy with one manual BC Bid check; (b) open the MCM/Foundation conversation on VGH+ (architect named, seat open, no IBC gate); (c) put KOR on one GC’s pursuit-team bench (Graham, Bird, or EllisDon) before the Squamish/West Van RFP and Surrey Memorial RFQ land; (d) run the UHNBC probe via the July-10 DIALOG meeting; (e) track EKRH’s DB award.</w:t>
+      </w:r>
+    </w:p>
+    <w:p>
+      <w:pPr>
+        <w:pStyle w:val="Heading2"/>
+      </w:pPr>
+      <w:bookmarkStart w:id="8" w:name="X0813d5ff6208524b26176c85587700616a70e60"/>
+      <w:bookmarkEnd w:id="7"/>
+      <w:r>
+        <w:t>6. Honesty ledger (what a skeptic should know)</w:t>
       </w:r>
     </w:p>
     <w:p>
@@ -1762,7 +1728,7 @@
         <w:pStyle w:val="Compact"/>
         <w:numPr>
           <w:ilvl w:val="0"/>
-          <w:numId w:val="6"/>
+          <w:numId w:val="7"/>
         </w:numPr>
       </w:pPr>
       <w:r>
@@ -1770,11 +1736,13 @@
           <w:b/>
           <w:bCs/>
         </w:rPr>
-        <w:lastRenderedPageBreak/>
-        <w:t>Systemic caveat:</w:t>
-      </w:r>
-      <w:r>
-        <w:t xml:space="preserve"> every pre-Q2-2026 status in any source predates the Budget-2026 re-pacing — statuses here were re-verified against post-February coverage wherever possible.</w:t>
+        <w:t>Value conflicts unresolved:</w:t>
+      </w:r>
+      <w:r>
+        <w:t xml:space="preserve"> </w:t>
+      </w:r>
+      <w:r>
+        <w:t>EKRH $58.9M vs $104.7M; Dr. F.W. Green $156.5M vs $232M; RIH $457M vs $490M — health-authority list pages contradict their own project releases; this map prefers dedicated project pages and says so per row in the source files.</w:t>
       </w:r>
     </w:p>
     <w:p>
@@ -1782,7 +1750,7 @@
         <w:pStyle w:val="Compact"/>
         <w:numPr>
           <w:ilvl w:val="0"/>
-          <w:numId w:val="6"/>
+          <w:numId w:val="7"/>
         </w:numPr>
       </w:pPr>
       <w:r>
@@ -1790,6 +1758,67 @@
           <w:b/>
           <w:bCs/>
         </w:rPr>
+        <w:t>Schedule conflicts:</w:t>
+      </w:r>
+      <w:r>
+        <w:t xml:space="preserve"> Richmond construction “2026→2029” (Aug 2024 release) vs “2028→2033” (post-Budget-2026 reporting) — the later dates are treated as current.</w:t>
+      </w:r>
+    </w:p>
+    <w:p>
+      <w:pPr>
+        <w:pStyle w:val="Compact"/>
+        <w:numPr>
+          <w:ilvl w:val="0"/>
+          <w:numId w:val="7"/>
+        </w:numPr>
+      </w:pPr>
+      <w:r>
+        <w:rPr>
+          <w:b/>
+          <w:bCs/>
+        </w:rPr>
+        <w:lastRenderedPageBreak/>
+        <w:t>Genuinely unknown:</w:t>
+      </w:r>
+      <w:r>
+        <w:t xml:space="preserve"> </w:t>
+      </w:r>
+      <w:r>
+        <w:t>New Surrey’s SE identity (undisclosed, u/c); UHNBC’s structural arrangement (unannounced); Port Hardy’s team; Burnaby Ph2’s post-refresh shape; BC Bid contents (not machine-readable).</w:t>
+      </w:r>
+    </w:p>
+    <w:p>
+      <w:pPr>
+        <w:pStyle w:val="Compact"/>
+        <w:numPr>
+          <w:ilvl w:val="0"/>
+          <w:numId w:val="7"/>
+        </w:numPr>
+      </w:pPr>
+      <w:r>
+        <w:rPr>
+          <w:b/>
+          <w:bCs/>
+        </w:rPr>
+        <w:t>Systemic caveat:</w:t>
+      </w:r>
+      <w:r>
+        <w:t xml:space="preserve"> every pre-Q2-2026 status in any source predates the Budget-2026 re-pacing — statuses here were re-verified against post-February coverage wherever possible.</w:t>
+      </w:r>
+    </w:p>
+    <w:p>
+      <w:pPr>
+        <w:pStyle w:val="Compact"/>
+        <w:numPr>
+          <w:ilvl w:val="0"/>
+          <w:numId w:val="7"/>
+        </w:numPr>
+      </w:pPr>
+      <w:r>
+        <w:rPr>
+          <w:b/>
+          <w:bCs/>
+        </w:rPr>
         <w:t>Method:</w:t>
       </w:r>
       <w:r>
@@ -1801,7 +1830,7 @@
     </w:p>
     <w:p>
       <w:r>
-        <w:pict w14:anchorId="5E041A16">
+        <w:pict w14:anchorId="4641E68E">
           <v:rect id="_x0000_i1026" style="width:0;height:1.5pt" o:hralign="center" o:hrstd="t" o:hr="t"/>
         </w:pict>
       </w:r>
@@ -1838,7 +1867,7 @@
   <w:abstractNum w:abstractNumId="0" w15:restartNumberingAfterBreak="0">
     <w:nsid w:val="0000A990"/>
     <w:multiLevelType w:val="multilevel"/>
-    <w:tmpl w:val="BBE84A50"/>
+    <w:tmpl w:val="2C46EF16"/>
     <w:lvl w:ilvl="0">
       <w:numFmt w:val="bullet"/>
       <w:lvlText w:val=" "/>
@@ -1915,7 +1944,7 @@
   <w:abstractNum w:abstractNumId="1" w15:restartNumberingAfterBreak="0">
     <w:nsid w:val="0000A991"/>
     <w:multiLevelType w:val="multilevel"/>
-    <w:tmpl w:val="7A1E643A"/>
+    <w:tmpl w:val="8B2455BC"/>
     <w:lvl w:ilvl="0">
       <w:numFmt w:val="bullet"/>
       <w:lvlText w:val=""/>
@@ -2019,7 +2048,7 @@
   <w:abstractNum w:abstractNumId="2" w15:restartNumberingAfterBreak="0">
     <w:nsid w:val="00A99411"/>
     <w:multiLevelType w:val="multilevel"/>
-    <w:tmpl w:val="3316204C"/>
+    <w:tmpl w:val="5DA2626E"/>
     <w:lvl w:ilvl="0">
       <w:start w:val="1"/>
       <w:numFmt w:val="decimal"/>
@@ -2102,10 +2131,96 @@
       </w:pPr>
     </w:lvl>
   </w:abstractNum>
-  <w:num w:numId="1" w16cid:durableId="256862756">
+  <w:abstractNum w:abstractNumId="3" w15:restartNumberingAfterBreak="0">
+    <w:nsid w:val="00A99414"/>
+    <w:multiLevelType w:val="multilevel"/>
+    <w:tmpl w:val="A72007A0"/>
+    <w:lvl w:ilvl="0">
+      <w:start w:val="4"/>
+      <w:numFmt w:val="decimal"/>
+      <w:lvlText w:val="%1."/>
+      <w:lvlJc w:val="left"/>
+      <w:pPr>
+        <w:ind w:left="720" w:hanging="360"/>
+      </w:pPr>
+    </w:lvl>
+    <w:lvl w:ilvl="1">
+      <w:start w:val="4"/>
+      <w:numFmt w:val="decimal"/>
+      <w:lvlText w:val="%2."/>
+      <w:lvlJc w:val="left"/>
+      <w:pPr>
+        <w:ind w:left="1440" w:hanging="360"/>
+      </w:pPr>
+    </w:lvl>
+    <w:lvl w:ilvl="2">
+      <w:start w:val="4"/>
+      <w:numFmt w:val="decimal"/>
+      <w:lvlText w:val="%3."/>
+      <w:lvlJc w:val="left"/>
+      <w:pPr>
+        <w:ind w:left="2160" w:hanging="360"/>
+      </w:pPr>
+    </w:lvl>
+    <w:lvl w:ilvl="3">
+      <w:start w:val="4"/>
+      <w:numFmt w:val="decimal"/>
+      <w:lvlText w:val="%4."/>
+      <w:lvlJc w:val="left"/>
+      <w:pPr>
+        <w:ind w:left="2880" w:hanging="360"/>
+      </w:pPr>
+    </w:lvl>
+    <w:lvl w:ilvl="4">
+      <w:start w:val="4"/>
+      <w:numFmt w:val="decimal"/>
+      <w:lvlText w:val="%5."/>
+      <w:lvlJc w:val="left"/>
+      <w:pPr>
+        <w:ind w:left="3600" w:hanging="360"/>
+      </w:pPr>
+    </w:lvl>
+    <w:lvl w:ilvl="5">
+      <w:start w:val="4"/>
+      <w:numFmt w:val="decimal"/>
+      <w:lvlText w:val="%6."/>
+      <w:lvlJc w:val="left"/>
+      <w:pPr>
+        <w:ind w:left="4320" w:hanging="360"/>
+      </w:pPr>
+    </w:lvl>
+    <w:lvl w:ilvl="6">
+      <w:start w:val="4"/>
+      <w:numFmt w:val="decimal"/>
+      <w:lvlText w:val="%7."/>
+      <w:lvlJc w:val="left"/>
+      <w:pPr>
+        <w:ind w:left="5040" w:hanging="360"/>
+      </w:pPr>
+    </w:lvl>
+    <w:lvl w:ilvl="7">
+      <w:start w:val="4"/>
+      <w:numFmt w:val="decimal"/>
+      <w:lvlText w:val="%8."/>
+      <w:lvlJc w:val="left"/>
+      <w:pPr>
+        <w:ind w:left="5760" w:hanging="360"/>
+      </w:pPr>
+    </w:lvl>
+    <w:lvl w:ilvl="8">
+      <w:start w:val="4"/>
+      <w:numFmt w:val="decimal"/>
+      <w:lvlText w:val="%9."/>
+      <w:lvlJc w:val="left"/>
+      <w:pPr>
+        <w:ind w:left="6480" w:hanging="360"/>
+      </w:pPr>
+    </w:lvl>
+  </w:abstractNum>
+  <w:num w:numId="1" w16cid:durableId="1339188057">
     <w:abstractNumId w:val="0"/>
   </w:num>
-  <w:num w:numId="2" w16cid:durableId="132792627">
+  <w:num w:numId="2" w16cid:durableId="1424031772">
     <w:abstractNumId w:val="2"/>
     <w:lvlOverride w:ilvl="0">
       <w:startOverride w:val="1"/>
@@ -2135,7 +2250,7 @@
       <w:startOverride w:val="1"/>
     </w:lvlOverride>
   </w:num>
-  <w:num w:numId="3" w16cid:durableId="1350445811">
+  <w:num w:numId="3" w16cid:durableId="817261464">
     <w:abstractNumId w:val="2"/>
     <w:lvlOverride w:ilvl="0">
       <w:startOverride w:val="1"/>
@@ -2165,13 +2280,43 @@
       <w:startOverride w:val="1"/>
     </w:lvlOverride>
   </w:num>
-  <w:num w:numId="4" w16cid:durableId="353729526">
+  <w:num w:numId="4" w16cid:durableId="470292068">
+    <w:abstractNumId w:val="3"/>
+    <w:lvlOverride w:ilvl="0">
+      <w:startOverride w:val="4"/>
+    </w:lvlOverride>
+    <w:lvlOverride w:ilvl="1">
+      <w:startOverride w:val="4"/>
+    </w:lvlOverride>
+    <w:lvlOverride w:ilvl="2">
+      <w:startOverride w:val="4"/>
+    </w:lvlOverride>
+    <w:lvlOverride w:ilvl="3">
+      <w:startOverride w:val="4"/>
+    </w:lvlOverride>
+    <w:lvlOverride w:ilvl="4">
+      <w:startOverride w:val="4"/>
+    </w:lvlOverride>
+    <w:lvlOverride w:ilvl="5">
+      <w:startOverride w:val="4"/>
+    </w:lvlOverride>
+    <w:lvlOverride w:ilvl="6">
+      <w:startOverride w:val="4"/>
+    </w:lvlOverride>
+    <w:lvlOverride w:ilvl="7">
+      <w:startOverride w:val="4"/>
+    </w:lvlOverride>
+    <w:lvlOverride w:ilvl="8">
+      <w:startOverride w:val="4"/>
+    </w:lvlOverride>
+  </w:num>
+  <w:num w:numId="5" w16cid:durableId="838155747">
     <w:abstractNumId w:val="1"/>
   </w:num>
-  <w:num w:numId="5" w16cid:durableId="1031030597">
+  <w:num w:numId="6" w16cid:durableId="1168402618">
     <w:abstractNumId w:val="1"/>
   </w:num>
-  <w:num w:numId="6" w16cid:durableId="1600671954">
+  <w:num w:numId="7" w16cid:durableId="1325086454">
     <w:abstractNumId w:val="1"/>
   </w:num>
 </w:numbering>
@@ -3408,7 +3553,7 @@
     <w:name w:val="Grid Table 4"/>
     <w:basedOn w:val="TableNormal"/>
     <w:uiPriority w:val="49"/>
-    <w:rsid w:val="00872D22"/>
+    <w:rsid w:val="00437383"/>
     <w:pPr>
       <w:spacing w:after="0"/>
     </w:pPr>

</xml_diff>

<commit_message>
docs(bd): plain-language stragglers in playbook + health map footers
Two remaining process-language spots swept ("ingested" -> "filed into the BD
database"; provider/scratchpad footer -> plain reference). All six recent BD
docs now verified free of internal jargon.

Co-Authored-By: Claude Fable 5 <noreply@anthropic.com>
</commit_message>
<xml_diff>
--- a/docs/KOR-BC-Health-Capital-Map-2026-07-01.docx
+++ b/docs/KOR-BC-Health-Capital-Map-2026-07-01.docx
@@ -82,7 +82,7 @@
     </w:p>
     <w:p>
       <w:r>
-        <w:pict w14:anchorId="290880CC">
+        <w:pict w14:anchorId="37E6A48F">
           <v:rect id="_x0000_i1025" style="width:0;height:1.5pt" o:hralign="center" o:hrstd="t" o:hr="t"/>
         </w:pict>
       </w:r>
@@ -1830,7 +1830,7 @@
     </w:p>
     <w:p>
       <w:r>
-        <w:pict w14:anchorId="4641E68E">
+        <w:pict w14:anchorId="2643E202">
           <v:rect id="_x0000_i1026" style="width:0;height:1.5pt" o:hralign="center" o:hrstd="t" o:hr="t"/>
         </w:pict>
       </w:r>
@@ -1844,7 +1844,7 @@
           <w:i/>
           <w:iCs/>
         </w:rPr>
-        <w:t>All organizations, seats, and gates in this map are filed in the BD platform (provider: BCHealth-Map-2026-07-01) with the open seats stamped for the dashboard. Full per-project source tables: scratchpad research files metro.md, regions.md, architects-se.md + the Interior Health and Cowichan/UHNBC verification reports.</w:t>
+        <w:t>All organizations, seats, and gates in this map are filed in KOR’s BD database (dated 2026-07-01), with the genuinely open seats flagged on the dashboard. Full per-project source tables live in the underlying research files retained with this report.</w:t>
       </w:r>
       <w:bookmarkEnd w:id="0"/>
       <w:bookmarkEnd w:id="8"/>
@@ -1867,7 +1867,7 @@
   <w:abstractNum w:abstractNumId="0" w15:restartNumberingAfterBreak="0">
     <w:nsid w:val="0000A990"/>
     <w:multiLevelType w:val="multilevel"/>
-    <w:tmpl w:val="2C46EF16"/>
+    <w:tmpl w:val="AA948A2C"/>
     <w:lvl w:ilvl="0">
       <w:numFmt w:val="bullet"/>
       <w:lvlText w:val=" "/>
@@ -1944,7 +1944,7 @@
   <w:abstractNum w:abstractNumId="1" w15:restartNumberingAfterBreak="0">
     <w:nsid w:val="0000A991"/>
     <w:multiLevelType w:val="multilevel"/>
-    <w:tmpl w:val="8B2455BC"/>
+    <w:tmpl w:val="21480F82"/>
     <w:lvl w:ilvl="0">
       <w:numFmt w:val="bullet"/>
       <w:lvlText w:val=""/>
@@ -2048,7 +2048,7 @@
   <w:abstractNum w:abstractNumId="2" w15:restartNumberingAfterBreak="0">
     <w:nsid w:val="00A99411"/>
     <w:multiLevelType w:val="multilevel"/>
-    <w:tmpl w:val="5DA2626E"/>
+    <w:tmpl w:val="5450ECC0"/>
     <w:lvl w:ilvl="0">
       <w:start w:val="1"/>
       <w:numFmt w:val="decimal"/>
@@ -2134,7 +2134,7 @@
   <w:abstractNum w:abstractNumId="3" w15:restartNumberingAfterBreak="0">
     <w:nsid w:val="00A99414"/>
     <w:multiLevelType w:val="multilevel"/>
-    <w:tmpl w:val="A72007A0"/>
+    <w:tmpl w:val="B372C354"/>
     <w:lvl w:ilvl="0">
       <w:start w:val="4"/>
       <w:numFmt w:val="decimal"/>
@@ -2217,10 +2217,10 @@
       </w:pPr>
     </w:lvl>
   </w:abstractNum>
-  <w:num w:numId="1" w16cid:durableId="1339188057">
+  <w:num w:numId="1" w16cid:durableId="1675961622">
     <w:abstractNumId w:val="0"/>
   </w:num>
-  <w:num w:numId="2" w16cid:durableId="1424031772">
+  <w:num w:numId="2" w16cid:durableId="1248729222">
     <w:abstractNumId w:val="2"/>
     <w:lvlOverride w:ilvl="0">
       <w:startOverride w:val="1"/>
@@ -2250,7 +2250,7 @@
       <w:startOverride w:val="1"/>
     </w:lvlOverride>
   </w:num>
-  <w:num w:numId="3" w16cid:durableId="817261464">
+  <w:num w:numId="3" w16cid:durableId="790126864">
     <w:abstractNumId w:val="2"/>
     <w:lvlOverride w:ilvl="0">
       <w:startOverride w:val="1"/>
@@ -2280,7 +2280,7 @@
       <w:startOverride w:val="1"/>
     </w:lvlOverride>
   </w:num>
-  <w:num w:numId="4" w16cid:durableId="470292068">
+  <w:num w:numId="4" w16cid:durableId="924069080">
     <w:abstractNumId w:val="3"/>
     <w:lvlOverride w:ilvl="0">
       <w:startOverride w:val="4"/>
@@ -2310,13 +2310,13 @@
       <w:startOverride w:val="4"/>
     </w:lvlOverride>
   </w:num>
-  <w:num w:numId="5" w16cid:durableId="838155747">
+  <w:num w:numId="5" w16cid:durableId="1550415934">
     <w:abstractNumId w:val="1"/>
   </w:num>
-  <w:num w:numId="6" w16cid:durableId="1168402618">
+  <w:num w:numId="6" w16cid:durableId="2077241200">
     <w:abstractNumId w:val="1"/>
   </w:num>
-  <w:num w:numId="7" w16cid:durableId="1325086454">
+  <w:num w:numId="7" w16cid:durableId="1181239170">
     <w:abstractNumId w:val="1"/>
   </w:num>
 </w:numbering>
@@ -3553,7 +3553,7 @@
     <w:name w:val="Grid Table 4"/>
     <w:basedOn w:val="TableNormal"/>
     <w:uiPriority w:val="49"/>
-    <w:rsid w:val="00437383"/>
+    <w:rsid w:val="00FF4170"/>
     <w:pPr>
       <w:spacing w:after="0"/>
     </w:pPr>

</xml_diff>